<commit_message>
Connect treatment plans to decisions and clarify clinical navigation
</commit_message>
<xml_diff>
--- a/evidence/2026-10-25/docs/01_HCC_High_Risk_Protocol_v12.docx
+++ b/evidence/2026-10-25/docs/01_HCC_High_Risk_Protocol_v12.docx
@@ -4,11 +4,17 @@
   <w:body>
     <w:p>
       <w:pPr>
+        <w:rPr>
+          <w:color w:val="A8470A"/>
+        </w:rPr>
         <w:pStyle w:val="Heading1"/>
         <w:keepNext/>
         <w:widowControl/>
       </w:pPr>
       <w:r>
+        <w:rPr>
+          <w:color w:val="A8470A"/>
+        </w:rPr>
         <w:t xml:space="preserve">UTHealth Houston and Memorial Hermann High Risk Liver Transplant Protocol for Hepatocellular Carcinoma V12</w:t>
       </w:r>
     </w:p>
@@ -32,11 +38,17 @@
     </w:p>
     <w:p>
       <w:pPr>
+        <w:rPr>
+          <w:color w:val="A8470A"/>
+        </w:rPr>
         <w:pStyle w:val="Heading2"/>
         <w:keepNext/>
         <w:widowControl/>
       </w:pPr>
       <w:r>
+        <w:rPr>
+          <w:color w:val="A8470A"/>
+        </w:rPr>
         <w:t xml:space="preserve">Policy and allocation status</w:t>
       </w:r>
     </w:p>
@@ -145,11 +157,17 @@
     </w:p>
     <w:p>
       <w:pPr>
+        <w:rPr>
+          <w:color w:val="A8470A"/>
+        </w:rPr>
         <w:pStyle w:val="Heading2"/>
         <w:keepNext/>
         <w:widowControl/>
       </w:pPr>
       <w:r>
+        <w:rPr>
+          <w:color w:val="A8470A"/>
+        </w:rPr>
         <w:t xml:space="preserve">1 Purpose and scope</w:t>
       </w:r>
     </w:p>
@@ -363,11 +381,17 @@
     </w:p>
     <w:p>
       <w:pPr>
+        <w:rPr>
+          <w:color w:val="A8470A"/>
+        </w:rPr>
         <w:pStyle w:val="Heading2"/>
         <w:keepNext/>
         <w:widowControl/>
       </w:pPr>
       <w:r>
+        <w:rPr>
+          <w:color w:val="A8470A"/>
+        </w:rPr>
         <w:t xml:space="preserve">2 Multidisciplinary team</w:t>
       </w:r>
     </w:p>
@@ -399,21 +423,33 @@
     </w:p>
     <w:p>
       <w:pPr>
+        <w:rPr>
+          <w:color w:val="A8470A"/>
+        </w:rPr>
         <w:pStyle w:val="Heading2"/>
         <w:keepNext/>
         <w:widowControl/>
       </w:pPr>
       <w:r>
+        <w:rPr>
+          <w:color w:val="A8470A"/>
+        </w:rPr>
         <w:t xml:space="preserve">3 Patient selection and baseline workup</w:t>
       </w:r>
     </w:p>
     <w:p>
       <w:pPr>
+        <w:rPr>
+          <w:color w:val="A8470A"/>
+        </w:rPr>
         <w:pStyle w:val="Heading3"/>
         <w:keepNext/>
         <w:widowControl/>
       </w:pPr>
       <w:r>
+        <w:rPr>
+          <w:color w:val="A8470A"/>
+        </w:rPr>
         <w:t xml:space="preserve">3.1 Confirm diagnosis and map the original disease</w:t>
       </w:r>
     </w:p>
@@ -695,11 +731,17 @@
     </w:p>
     <w:p>
       <w:pPr>
+        <w:rPr>
+          <w:color w:val="A8470A"/>
+        </w:rPr>
         <w:pStyle w:val="Heading3"/>
         <w:keepNext/>
         <w:widowControl/>
       </w:pPr>
       <w:r>
+        <w:rPr>
+          <w:color w:val="A8470A"/>
+        </w:rPr>
         <w:t xml:space="preserve">3.2 Expanded burden and biomarkers</w:t>
       </w:r>
     </w:p>
@@ -968,23 +1010,35 @@
     </w:p>
     <w:p>
       <w:pPr>
+        <w:rPr>
+          <w:color w:val="A8470A"/>
+        </w:rPr>
         <w:pStyle w:val="Heading3"/>
         <w:keepNext/>
         <w:widowControl/>
       </w:pPr>
       <w:bookmarkStart w:id="1" w:name="HCC_B1"/>
       <w:r>
+        <w:rPr>
+          <w:color w:val="A8470A"/>
+        </w:rPr>
         <w:t xml:space="preserve">HCC-B1 — How far beyond UNOS-DS should the program attempt downstaging?</w:t>
       </w:r>
       <w:bookmarkEnd w:id="1"/>
     </w:p>
     <w:p>
       <w:pPr>
+        <w:rPr>
+          <w:color w:val="A8470A"/>
+        </w:rPr>
         <w:pStyle w:val="Heading3"/>
         <w:keepNext/>
         <w:widowControl/>
       </w:pPr>
       <w:r>
+        <w:rPr>
+          <w:color w:val="A8470A"/>
+        </w:rPr>
         <w:t xml:space="preserve">Question and comparison</w:t>
       </w:r>
     </w:p>
@@ -1000,11 +1054,17 @@
     </w:p>
     <w:p>
       <w:pPr>
+        <w:rPr>
+          <w:color w:val="A8470A"/>
+        </w:rPr>
         <w:pStyle w:val="Heading3"/>
         <w:keepNext/>
         <w:widowControl/>
       </w:pPr>
       <w:r>
+        <w:rPr>
+          <w:color w:val="A8470A"/>
+        </w:rPr>
         <w:t xml:space="preserve">Evidence before choosing a rule</w:t>
       </w:r>
     </w:p>
@@ -2428,11 +2488,17 @@
     </w:tbl>
     <w:p>
       <w:pPr>
+        <w:rPr>
+          <w:color w:val="A8470A"/>
+        </w:rPr>
         <w:pStyle w:val="Heading3"/>
         <w:keepNext/>
         <w:widowControl/>
       </w:pPr>
       <w:r>
+        <w:rPr>
+          <w:color w:val="A8470A"/>
+        </w:rPr>
         <w:t xml:space="preserve">Synthesis and evidence that challenges the proposal</w:t>
       </w:r>
     </w:p>
@@ -2782,11 +2848,17 @@
     </w:p>
     <w:p>
       <w:pPr>
+        <w:rPr>
+          <w:color w:val="A8470A"/>
+        </w:rPr>
         <w:pStyle w:val="Heading3"/>
         <w:keepNext/>
         <w:widowControl/>
       </w:pPr>
       <w:r>
+        <w:rPr>
+          <w:color w:val="A8470A"/>
+        </w:rPr>
         <w:t xml:space="preserve">Where each proposed threshold comes from</w:t>
       </w:r>
     </w:p>
@@ -2806,11 +2878,17 @@
     </w:p>
     <w:p>
       <w:pPr>
+        <w:rPr>
+          <w:color w:val="A8470A"/>
+        </w:rPr>
         <w:pStyle w:val="Heading3"/>
         <w:keepNext/>
         <w:widowControl/>
       </w:pPr>
       <w:r>
+        <w:rPr>
+          <w:color w:val="A8470A"/>
+        </w:rPr>
         <w:t xml:space="preserve">Source wording — read in context</w:t>
       </w:r>
     </w:p>
@@ -3314,11 +3392,17 @@
     </w:p>
     <w:p>
       <w:pPr>
+        <w:rPr>
+          <w:color w:val="A8470A"/>
+        </w:rPr>
         <w:pStyle w:val="Heading3"/>
         <w:keepNext/>
         <w:widowControl/>
       </w:pPr>
       <w:r>
+        <w:rPr>
+          <w:color w:val="A8470A"/>
+        </w:rPr>
         <w:t xml:space="preserve">OPEN recommendation after the evidence review</w:t>
       </w:r>
     </w:p>
@@ -3831,11 +3915,17 @@
     </w:p>
     <w:p>
       <w:pPr>
+        <w:rPr>
+          <w:color w:val="A8470A"/>
+        </w:rPr>
         <w:pStyle w:val="Heading3"/>
         <w:keepNext/>
         <w:widowControl/>
       </w:pPr>
       <w:r>
+        <w:rPr>
+          <w:color w:val="A8470A"/>
+        </w:rPr>
         <w:t xml:space="preserve">Information required before the decision</w:t>
       </w:r>
     </w:p>
@@ -3923,11 +4013,17 @@
     </w:p>
     <w:p>
       <w:pPr>
+        <w:rPr>
+          <w:color w:val="A8470A"/>
+        </w:rPr>
         <w:pStyle w:val="Heading3"/>
         <w:keepNext/>
         <w:widowControl/>
       </w:pPr>
       <w:r>
+        <w:rPr>
+          <w:color w:val="A8470A"/>
+        </w:rPr>
         <w:t xml:space="preserve">3.3 Prior portal vein tumor thrombus</w:t>
       </w:r>
     </w:p>
@@ -4044,23 +4140,35 @@
     </w:p>
     <w:p>
       <w:pPr>
+        <w:rPr>
+          <w:color w:val="A8470A"/>
+        </w:rPr>
         <w:pStyle w:val="Heading3"/>
         <w:keepNext/>
         <w:widowControl/>
       </w:pPr>
       <w:bookmarkStart w:id="2" w:name="HCC_B2"/>
       <w:r>
+        <w:rPr>
+          <w:color w:val="A8470A"/>
+        </w:rPr>
         <w:t xml:space="preserve">HCC-B2 — Which PVTT anatomy could enter a transplanting study?</w:t>
       </w:r>
       <w:bookmarkEnd w:id="2"/>
     </w:p>
     <w:p>
       <w:pPr>
+        <w:rPr>
+          <w:color w:val="A8470A"/>
+        </w:rPr>
         <w:pStyle w:val="Heading3"/>
         <w:keepNext/>
         <w:widowControl/>
       </w:pPr>
       <w:r>
+        <w:rPr>
+          <w:color w:val="A8470A"/>
+        </w:rPr>
         <w:t xml:space="preserve">Question and comparison</w:t>
       </w:r>
     </w:p>
@@ -4076,11 +4184,17 @@
     </w:p>
     <w:p>
       <w:pPr>
+        <w:rPr>
+          <w:color w:val="A8470A"/>
+        </w:rPr>
         <w:pStyle w:val="Heading3"/>
         <w:keepNext/>
         <w:widowControl/>
       </w:pPr>
       <w:r>
+        <w:rPr>
+          <w:color w:val="A8470A"/>
+        </w:rPr>
         <w:t xml:space="preserve">Evidence before choosing a rule</w:t>
       </w:r>
     </w:p>
@@ -5336,11 +5450,17 @@
     </w:tbl>
     <w:p>
       <w:pPr>
+        <w:rPr>
+          <w:color w:val="A8470A"/>
+        </w:rPr>
         <w:pStyle w:val="Heading3"/>
         <w:keepNext/>
         <w:widowControl/>
       </w:pPr>
       <w:r>
+        <w:rPr>
+          <w:color w:val="A8470A"/>
+        </w:rPr>
         <w:t xml:space="preserve">PVTT outcomes underlying the open anatomy boundary</w:t>
       </w:r>
     </w:p>
@@ -5355,11 +5475,17 @@
     </w:p>
     <w:p>
       <w:pPr>
+        <w:rPr>
+          <w:color w:val="A8470A"/>
+        </w:rPr>
         <w:pStyle w:val="Heading3"/>
         <w:keepNext/>
         <w:widowControl/>
       </w:pPr>
       <w:r>
+        <w:rPr>
+          <w:color w:val="A8470A"/>
+        </w:rPr>
         <w:t xml:space="preserve">Individual Vp grades in the largest LDLT cohort reviewed</w:t>
       </w:r>
     </w:p>
@@ -6182,11 +6308,17 @@
     </w:p>
     <w:p>
       <w:pPr>
+        <w:rPr>
+          <w:color w:val="A8470A"/>
+        </w:rPr>
         <w:pStyle w:val="Heading3"/>
         <w:keepNext/>
         <w:widowControl/>
       </w:pPr>
       <w:r>
+        <w:rPr>
+          <w:color w:val="A8470A"/>
+        </w:rPr>
         <w:t xml:space="preserve">Anatomy comparisons in other transplant cohorts</w:t>
       </w:r>
     </w:p>
@@ -7471,11 +7603,17 @@
     </w:p>
     <w:p>
       <w:pPr>
+        <w:rPr>
+          <w:color w:val="A8470A"/>
+        </w:rPr>
         <w:pStyle w:val="Heading3"/>
         <w:keepNext/>
         <w:widowControl/>
       </w:pPr>
       <w:r>
+        <w:rPr>
+          <w:color w:val="A8470A"/>
+        </w:rPr>
         <w:t xml:space="preserve">Response matters and does not erase the anatomical uncertainty</w:t>
       </w:r>
     </w:p>
@@ -7968,11 +8106,17 @@
     </w:p>
     <w:p>
       <w:pPr>
+        <w:rPr>
+          <w:color w:val="A8470A"/>
+        </w:rPr>
         <w:pStyle w:val="Heading3"/>
         <w:keepNext/>
         <w:widowControl/>
       </w:pPr>
       <w:r>
+        <w:rPr>
+          <w:color w:val="A8470A"/>
+        </w:rPr>
         <w:t xml:space="preserve">Interpretation for HCC B2</w:t>
       </w:r>
     </w:p>
@@ -8374,11 +8518,17 @@
     </w:p>
     <w:p>
       <w:pPr>
+        <w:rPr>
+          <w:color w:val="A8470A"/>
+        </w:rPr>
         <w:pStyle w:val="Heading3"/>
         <w:keepNext/>
         <w:widowControl/>
       </w:pPr>
       <w:r>
+        <w:rPr>
+          <w:color w:val="A8470A"/>
+        </w:rPr>
         <w:t xml:space="preserve">Y90-to-LT: what the newly available full text changes</w:t>
       </w:r>
     </w:p>
@@ -8618,11 +8768,17 @@
     </w:p>
     <w:p>
       <w:pPr>
+        <w:rPr>
+          <w:color w:val="A8470A"/>
+        </w:rPr>
         <w:pStyle w:val="Heading3"/>
         <w:keepNext/>
         <w:widowControl/>
       </w:pPr>
       <w:r>
+        <w:rPr>
+          <w:color w:val="A8470A"/>
+        </w:rPr>
         <w:t xml:space="preserve">Synthesis and evidence that challenges the proposal</w:t>
       </w:r>
     </w:p>
@@ -8934,11 +9090,17 @@
     </w:p>
     <w:p>
       <w:pPr>
+        <w:rPr>
+          <w:color w:val="A8470A"/>
+        </w:rPr>
         <w:pStyle w:val="Heading3"/>
         <w:keepNext/>
         <w:widowControl/>
       </w:pPr>
       <w:r>
+        <w:rPr>
+          <w:color w:val="A8470A"/>
+        </w:rPr>
         <w:t xml:space="preserve">Where each proposed threshold comes from</w:t>
       </w:r>
     </w:p>
@@ -9014,11 +9176,17 @@
     </w:p>
     <w:p>
       <w:pPr>
+        <w:rPr>
+          <w:color w:val="A8470A"/>
+        </w:rPr>
         <w:pStyle w:val="Heading3"/>
         <w:keepNext/>
         <w:widowControl/>
       </w:pPr>
       <w:r>
+        <w:rPr>
+          <w:color w:val="A8470A"/>
+        </w:rPr>
         <w:t xml:space="preserve">Source wording — read in context</w:t>
       </w:r>
     </w:p>
@@ -9936,11 +10104,17 @@
     </w:p>
     <w:p>
       <w:pPr>
+        <w:rPr>
+          <w:color w:val="A8470A"/>
+        </w:rPr>
         <w:pStyle w:val="Heading3"/>
         <w:keepNext/>
         <w:widowControl/>
       </w:pPr>
       <w:r>
+        <w:rPr>
+          <w:color w:val="A8470A"/>
+        </w:rPr>
         <w:t xml:space="preserve">OPEN recommendation after the evidence review</w:t>
       </w:r>
     </w:p>
@@ -10442,11 +10616,17 @@
     </w:p>
     <w:p>
       <w:pPr>
+        <w:rPr>
+          <w:color w:val="A8470A"/>
+        </w:rPr>
         <w:pStyle w:val="Heading3"/>
         <w:keepNext/>
         <w:widowControl/>
       </w:pPr>
       <w:r>
+        <w:rPr>
+          <w:color w:val="A8470A"/>
+        </w:rPr>
         <w:t xml:space="preserve">Information required before the decision</w:t>
       </w:r>
     </w:p>
@@ -10534,21 +10714,33 @@
     </w:p>
     <w:p>
       <w:pPr>
+        <w:rPr>
+          <w:color w:val="A8470A"/>
+        </w:rPr>
         <w:pStyle w:val="Heading2"/>
         <w:keepNext/>
         <w:widowControl/>
       </w:pPr>
       <w:r>
+        <w:rPr>
+          <w:color w:val="A8470A"/>
+        </w:rPr>
         <w:t xml:space="preserve">4 Downstaging treatment and response assessment</w:t>
       </w:r>
     </w:p>
     <w:p>
       <w:pPr>
+        <w:rPr>
+          <w:color w:val="A8470A"/>
+        </w:rPr>
         <w:pStyle w:val="Heading1"/>
         <w:widowControl/>
         <w:keepNext/>
       </w:pPr>
       <w:r>
+        <w:rPr>
+          <w:color w:val="A8470A"/>
+        </w:rPr>
         <w:t xml:space="preserve">V12 evidence-integrated treatment and reassessment</w:t>
       </w:r>
     </w:p>
@@ -10564,12 +10756,18 @@
     </w:p>
     <w:p>
       <w:pPr>
+        <w:rPr>
+          <w:color w:val="A8470A"/>
+        </w:rPr>
         <w:pStyle w:val="Heading1"/>
         <w:widowControl/>
         <w:keepNext/>
       </w:pPr>
       <w:bookmarkStart w:id="12001" w:name="HCC_B1_1"/>
       <w:r>
+        <w:rPr>
+          <w:color w:val="A8470A"/>
+        </w:rPr>
         <w:t xml:space="preserve">HCC B1.1 — AFP-only failure / imaging discordance — OPEN</w:t>
       </w:r>
       <w:bookmarkEnd w:id="12001"/>
@@ -11394,21 +11592,33 @@
     </w:p>
     <w:p>
       <w:pPr>
+        <w:rPr>
+          <w:color w:val="A8470A"/>
+        </w:rPr>
         <w:pStyle w:val="Heading2"/>
         <w:widowControl/>
         <w:keepNext/>
       </w:pPr>
       <w:r>
+        <w:rPr>
+          <w:color w:val="A8470A"/>
+        </w:rPr>
         <w:t xml:space="preserve">Full-text evidence and its limits</w:t>
       </w:r>
     </w:p>
     <w:p>
       <w:pPr>
+        <w:rPr>
+          <w:color w:val="A8470A"/>
+        </w:rPr>
         <w:pStyle w:val="Heading2"/>
         <w:widowControl/>
         <w:keepNext/>
       </w:pPr>
       <w:r>
+        <w:rPr>
+          <w:color w:val="A8470A"/>
+        </w:rPr>
         <w:t xml:space="preserve">Mehta 2019: AFP response</w:t>
       </w:r>
     </w:p>
@@ -11507,11 +11717,17 @@
     </w:p>
     <w:p>
       <w:pPr>
+        <w:rPr>
+          <w:color w:val="A8470A"/>
+        </w:rPr>
         <w:pStyle w:val="Heading2"/>
         <w:widowControl/>
         <w:keepNext/>
       </w:pPr>
       <w:r>
+        <w:rPr>
+          <w:color w:val="A8470A"/>
+        </w:rPr>
         <w:t xml:space="preserve">Goldman 2022: final AFP ≥500</w:t>
       </w:r>
     </w:p>
@@ -11610,11 +11826,17 @@
     </w:p>
     <w:p>
       <w:pPr>
+        <w:rPr>
+          <w:color w:val="A8470A"/>
+        </w:rPr>
         <w:pStyle w:val="Heading2"/>
         <w:widowControl/>
         <w:keepNext/>
       </w:pPr>
       <w:r>
+        <w:rPr>
+          <w:color w:val="A8470A"/>
+        </w:rPr>
         <w:t xml:space="preserve">Giard 2018: AFP slope</w:t>
       </w:r>
     </w:p>
@@ -11713,11 +11935,17 @@
     </w:p>
     <w:p>
       <w:pPr>
+        <w:rPr>
+          <w:color w:val="A8470A"/>
+        </w:rPr>
         <w:pStyle w:val="Heading2"/>
         <w:widowControl/>
         <w:keepNext/>
       </w:pPr>
       <w:r>
+        <w:rPr>
+          <w:color w:val="A8470A"/>
+        </w:rPr>
         <w:t xml:space="preserve">Halazun 2021: dynamic AFP/NYCA</w:t>
       </w:r>
     </w:p>
@@ -11816,11 +12044,17 @@
     </w:p>
     <w:p>
       <w:pPr>
+        <w:rPr>
+          <w:color w:val="A8470A"/>
+        </w:rPr>
         <w:pStyle w:val="Heading2"/>
         <w:widowControl/>
         <w:keepNext/>
       </w:pPr>
       <w:r>
+        <w:rPr>
+          <w:color w:val="A8470A"/>
+        </w:rPr>
         <w:t xml:space="preserve">Moriyama 2026: markers before imaging recurrence</w:t>
       </w:r>
     </w:p>
@@ -11919,11 +12153,17 @@
     </w:p>
     <w:p>
       <w:pPr>
+        <w:rPr>
+          <w:color w:val="A8470A"/>
+        </w:rPr>
         <w:pStyle w:val="Heading2"/>
         <w:widowControl/>
         <w:keepNext/>
       </w:pPr>
       <w:r>
+        <w:rPr>
+          <w:color w:val="A8470A"/>
+        </w:rPr>
         <w:t xml:space="preserve">Source wording in context</w:t>
       </w:r>
     </w:p>
@@ -12452,11 +12692,17 @@
     </w:tbl>
     <w:p>
       <w:pPr>
+        <w:rPr>
+          <w:color w:val="A8470A"/>
+        </w:rPr>
         <w:pStyle w:val="Heading2"/>
         <w:widowControl/>
         <w:keepNext/>
       </w:pPr>
       <w:r>
+        <w:rPr>
+          <w:color w:val="A8470A"/>
+        </w:rPr>
         <w:t xml:space="preserve">Order now</w:t>
       </w:r>
     </w:p>
@@ -12677,11 +12923,17 @@
     </w:p>
     <w:p>
       <w:pPr>
+        <w:rPr>
+          <w:color w:val="A8470A"/>
+        </w:rPr>
         <w:pStyle w:val="Heading2"/>
         <w:widowControl/>
         <w:keepNext/>
       </w:pPr>
       <w:r>
+        <w:rPr>
+          <w:color w:val="A8470A"/>
+        </w:rPr>
         <w:t xml:space="preserve">Advance only when</w:t>
       </w:r>
     </w:p>
@@ -12849,11 +13101,17 @@
     </w:p>
     <w:p>
       <w:pPr>
+        <w:rPr>
+          <w:color w:val="A8470A"/>
+        </w:rPr>
         <w:pStyle w:val="Heading2"/>
         <w:widowControl/>
         <w:keepNext/>
       </w:pPr>
       <w:r>
+        <w:rPr>
+          <w:color w:val="A8470A"/>
+        </w:rPr>
         <w:t xml:space="preserve">Hold and reassess</w:t>
       </w:r>
     </w:p>
@@ -13247,11 +13505,17 @@
     </w:p>
     <w:p>
       <w:pPr>
+        <w:rPr>
+          <w:color w:val="A8470A"/>
+        </w:rPr>
         <w:pStyle w:val="Heading2"/>
         <w:widowControl/>
         <w:keepNext/>
       </w:pPr>
       <w:r>
+        <w:rPr>
+          <w:color w:val="A8470A"/>
+        </w:rPr>
         <w:t xml:space="preserve">Do not do</w:t>
       </w:r>
     </w:p>
@@ -13510,11 +13774,17 @@
     </w:p>
     <w:p>
       <w:pPr>
+        <w:rPr>
+          <w:color w:val="A8470A"/>
+        </w:rPr>
         <w:pStyle w:val="Heading1"/>
         <w:widowControl/>
         <w:keepNext/>
       </w:pPr>
       <w:r>
+        <w:rPr>
+          <w:color w:val="A8470A"/>
+        </w:rPr>
         <w:t xml:space="preserve">4.1 Treatment-to-transplant interface</w:t>
       </w:r>
     </w:p>
@@ -13561,11 +13831,17 @@
     </w:p>
     <w:p>
       <w:pPr>
+        <w:rPr>
+          <w:color w:val="A8470A"/>
+        </w:rPr>
         <w:pStyle w:val="Heading2"/>
         <w:widowControl/>
         <w:keepNext/>
       </w:pPr>
       <w:r>
+        <w:rPr>
+          <w:color w:val="A8470A"/>
+        </w:rPr>
         <w:t xml:space="preserve">Before treatment</w:t>
       </w:r>
     </w:p>
@@ -13837,11 +14113,17 @@
     </w:p>
     <w:p>
       <w:pPr>
+        <w:rPr>
+          <w:color w:val="A8470A"/>
+        </w:rPr>
         <w:pStyle w:val="Heading2"/>
         <w:widowControl/>
         <w:keepNext/>
       </w:pPr>
       <w:r>
+        <w:rPr>
+          <w:color w:val="A8470A"/>
+        </w:rPr>
         <w:t xml:space="preserve">Response and the next transplant decision</w:t>
       </w:r>
     </w:p>
@@ -14205,11 +14487,17 @@
     </w:p>
     <w:p>
       <w:pPr>
+        <w:rPr>
+          <w:color w:val="A8470A"/>
+        </w:rPr>
         <w:pStyle w:val="Heading2"/>
         <w:widowControl/>
         <w:keepNext/>
       </w:pPr>
       <w:r>
+        <w:rPr>
+          <w:color w:val="A8470A"/>
+        </w:rPr>
         <w:t xml:space="preserve">Systemic exposure and operative safety</w:t>
       </w:r>
     </w:p>
@@ -14495,11 +14783,17 @@
     </w:p>
     <w:p>
       <w:pPr>
+        <w:rPr>
+          <w:color w:val="A8470A"/>
+        </w:rPr>
         <w:pStyle w:val="Heading2"/>
         <w:widowControl/>
         <w:keepNext/>
       </w:pPr>
       <w:r>
+        <w:rPr>
+          <w:color w:val="A8470A"/>
+        </w:rPr>
         <w:t xml:space="preserve">4.2 Existing ICI evidence and B3 decision — retained</w:t>
       </w:r>
     </w:p>
@@ -14840,23 +15134,35 @@
     </w:p>
     <w:p>
       <w:pPr>
+        <w:rPr>
+          <w:color w:val="A8470A"/>
+        </w:rPr>
         <w:pStyle w:val="Heading3"/>
         <w:keepNext/>
         <w:widowControl/>
       </w:pPr>
       <w:bookmarkStart w:id="3" w:name="HCC_B3"/>
       <w:r>
+        <w:rPr>
+          <w:color w:val="A8470A"/>
+        </w:rPr>
         <w:t xml:space="preserve">HCC-B3 — How should prior ICI alter activation and consent?</w:t>
       </w:r>
       <w:bookmarkEnd w:id="3"/>
     </w:p>
     <w:p>
       <w:pPr>
+        <w:rPr>
+          <w:color w:val="A8470A"/>
+        </w:rPr>
         <w:pStyle w:val="Heading3"/>
         <w:keepNext/>
         <w:widowControl/>
       </w:pPr>
       <w:r>
+        <w:rPr>
+          <w:color w:val="A8470A"/>
+        </w:rPr>
         <w:t xml:space="preserve">Question and comparison</w:t>
       </w:r>
     </w:p>
@@ -14872,11 +15178,17 @@
     </w:p>
     <w:p>
       <w:pPr>
+        <w:rPr>
+          <w:color w:val="A8470A"/>
+        </w:rPr>
         <w:pStyle w:val="Heading3"/>
         <w:keepNext/>
         <w:widowControl/>
       </w:pPr>
       <w:r>
+        <w:rPr>
+          <w:color w:val="A8470A"/>
+        </w:rPr>
         <w:t xml:space="preserve">Evidence before choosing a rule</w:t>
       </w:r>
     </w:p>
@@ -16636,11 +16948,17 @@
     </w:tbl>
     <w:p>
       <w:pPr>
+        <w:rPr>
+          <w:color w:val="A8470A"/>
+        </w:rPr>
         <w:pStyle w:val="Heading3"/>
         <w:keepNext/>
         <w:widowControl/>
       </w:pPr>
       <w:r>
+        <w:rPr>
+          <w:color w:val="A8470A"/>
+        </w:rPr>
         <w:t xml:space="preserve">Synthesis and evidence that challenges the proposal</w:t>
       </w:r>
     </w:p>
@@ -17066,11 +17384,17 @@
     </w:p>
     <w:p>
       <w:pPr>
+        <w:rPr>
+          <w:color w:val="A8470A"/>
+        </w:rPr>
         <w:pStyle w:val="Heading3"/>
         <w:keepNext/>
         <w:widowControl/>
       </w:pPr>
       <w:r>
+        <w:rPr>
+          <w:color w:val="A8470A"/>
+        </w:rPr>
         <w:t xml:space="preserve">Where each proposed threshold comes from</w:t>
       </w:r>
     </w:p>
@@ -17090,11 +17414,17 @@
     </w:p>
     <w:p>
       <w:pPr>
+        <w:rPr>
+          <w:color w:val="A8470A"/>
+        </w:rPr>
         <w:pStyle w:val="Heading3"/>
         <w:keepNext/>
         <w:widowControl/>
       </w:pPr>
       <w:r>
+        <w:rPr>
+          <w:color w:val="A8470A"/>
+        </w:rPr>
         <w:t xml:space="preserve">Source wording — read in context</w:t>
       </w:r>
     </w:p>
@@ -17460,11 +17790,17 @@
     </w:p>
     <w:p>
       <w:pPr>
+        <w:rPr>
+          <w:color w:val="A8470A"/>
+        </w:rPr>
         <w:pStyle w:val="Heading3"/>
         <w:keepNext/>
         <w:widowControl/>
       </w:pPr>
       <w:r>
+        <w:rPr>
+          <w:color w:val="A8470A"/>
+        </w:rPr>
         <w:t xml:space="preserve">OPEN recommendation after the evidence review</w:t>
       </w:r>
     </w:p>
@@ -18032,11 +18368,17 @@
     </w:p>
     <w:p>
       <w:pPr>
+        <w:rPr>
+          <w:color w:val="A8470A"/>
+        </w:rPr>
         <w:pStyle w:val="Heading3"/>
         <w:keepNext/>
         <w:widowControl/>
       </w:pPr>
       <w:r>
+        <w:rPr>
+          <w:color w:val="A8470A"/>
+        </w:rPr>
         <w:t xml:space="preserve">Information required before the decision</w:t>
       </w:r>
     </w:p>
@@ -18124,11 +18466,17 @@
     </w:p>
     <w:p>
       <w:pPr>
+        <w:rPr>
+          <w:color w:val="A8470A"/>
+        </w:rPr>
         <w:pStyle w:val="Heading3"/>
         <w:keepNext/>
         <w:widowControl/>
       </w:pPr>
       <w:r>
+        <w:rPr>
+          <w:color w:val="A8470A"/>
+        </w:rPr>
         <w:t xml:space="preserve">4.3 Advance or hold after treatment</w:t>
       </w:r>
     </w:p>
@@ -18249,11 +18597,17 @@
     </w:p>
     <w:p>
       <w:pPr>
+        <w:rPr>
+          <w:color w:val="A8470A"/>
+        </w:rPr>
         <w:pStyle w:val="Heading2"/>
         <w:keepNext/>
         <w:widowControl/>
       </w:pPr>
       <w:r>
+        <w:rPr>
+          <w:color w:val="A8470A"/>
+        </w:rPr>
         <w:t xml:space="preserve">5 Listing and transplant surgery</w:t>
       </w:r>
     </w:p>
@@ -18628,12 +18982,18 @@
     </w:p>
     <w:p>
       <w:pPr>
+        <w:rPr>
+          <w:color w:val="A8470A"/>
+        </w:rPr>
         <w:pStyle w:val="Heading3"/>
         <w:keepNext/>
         <w:widowControl/>
       </w:pPr>
       <w:bookmarkStart w:id="4" w:name="ALLOC_B1"/>
       <w:r>
+        <w:rPr>
+          <w:color w:val="A8470A"/>
+        </w:rPr>
         <w:t xml:space="preserve">ALLOC-B1 — What are we approving?</w:t>
       </w:r>
       <w:bookmarkEnd w:id="4"/>
@@ -18822,11 +19182,17 @@
     </w:p>
     <w:p>
       <w:pPr>
+        <w:rPr>
+          <w:color w:val="A8470A"/>
+        </w:rPr>
         <w:pStyle w:val="Heading3"/>
         <w:keepNext/>
         <w:widowControl/>
       </w:pPr>
       <w:r>
+        <w:rPr>
+          <w:color w:val="A8470A"/>
+        </w:rPr>
         <w:t xml:space="preserve">OPEN recommendation after the evidence review</w:t>
       </w:r>
     </w:p>
@@ -19083,11 +19449,17 @@
     </w:p>
     <w:p>
       <w:pPr>
+        <w:rPr>
+          <w:color w:val="A8470A"/>
+        </w:rPr>
         <w:pStyle w:val="Heading3"/>
         <w:keepNext/>
         <w:widowControl/>
       </w:pPr>
       <w:r>
+        <w:rPr>
+          <w:color w:val="A8470A"/>
+        </w:rPr>
         <w:t xml:space="preserve">Information required before the decision</w:t>
       </w:r>
     </w:p>
@@ -19175,12 +19547,18 @@
     </w:p>
     <w:p>
       <w:pPr>
+        <w:rPr>
+          <w:color w:val="A8470A"/>
+        </w:rPr>
         <w:pStyle w:val="Heading3"/>
         <w:keepNext/>
         <w:widowControl/>
       </w:pPr>
       <w:bookmarkStart w:id="5" w:name="ALLOC_B2"/>
       <w:r>
+        <w:rPr>
+          <w:color w:val="A8470A"/>
+        </w:rPr>
         <w:t xml:space="preserve">ALLOC-B2 — What is the relevant organ opportunity cost?</w:t>
       </w:r>
       <w:bookmarkEnd w:id="5"/>
@@ -19483,11 +19861,17 @@
     </w:p>
     <w:p>
       <w:pPr>
+        <w:rPr>
+          <w:color w:val="A8470A"/>
+        </w:rPr>
         <w:pStyle w:val="Heading3"/>
         <w:keepNext/>
         <w:widowControl/>
       </w:pPr>
       <w:r>
+        <w:rPr>
+          <w:color w:val="A8470A"/>
+        </w:rPr>
         <w:t xml:space="preserve">OPEN recommendation after the evidence review</w:t>
       </w:r>
     </w:p>
@@ -19858,11 +20242,17 @@
     </w:p>
     <w:p>
       <w:pPr>
+        <w:rPr>
+          <w:color w:val="A8470A"/>
+        </w:rPr>
         <w:pStyle w:val="Heading3"/>
         <w:keepNext/>
         <w:widowControl/>
       </w:pPr>
       <w:r>
+        <w:rPr>
+          <w:color w:val="A8470A"/>
+        </w:rPr>
         <w:t xml:space="preserve">Information required before the decision</w:t>
       </w:r>
     </w:p>
@@ -19950,12 +20340,18 @@
     </w:p>
     <w:p>
       <w:pPr>
+        <w:rPr>
+          <w:color w:val="A8470A"/>
+        </w:rPr>
         <w:pStyle w:val="Heading3"/>
         <w:keepNext/>
         <w:widowControl/>
       </w:pPr>
       <w:bookmarkStart w:id="6" w:name="ALLOC_B3"/>
       <w:r>
+        <w:rPr>
+          <w:color w:val="A8470A"/>
+        </w:rPr>
         <w:t xml:space="preserve">ALLOC-B3 — What must donor consent and follow-up include?</w:t>
       </w:r>
       <w:bookmarkEnd w:id="6"/>
@@ -20192,11 +20588,17 @@
     </w:p>
     <w:p>
       <w:pPr>
+        <w:rPr>
+          <w:color w:val="A8470A"/>
+        </w:rPr>
         <w:pStyle w:val="Heading3"/>
         <w:keepNext/>
         <w:widowControl/>
       </w:pPr>
       <w:r>
+        <w:rPr>
+          <w:color w:val="A8470A"/>
+        </w:rPr>
         <w:t xml:space="preserve">OPEN recommendation after the evidence review</w:t>
       </w:r>
     </w:p>
@@ -20491,11 +20893,17 @@
     </w:p>
     <w:p>
       <w:pPr>
+        <w:rPr>
+          <w:color w:val="A8470A"/>
+        </w:rPr>
         <w:pStyle w:val="Heading3"/>
         <w:keepNext/>
         <w:widowControl/>
       </w:pPr>
       <w:r>
+        <w:rPr>
+          <w:color w:val="A8470A"/>
+        </w:rPr>
         <w:t xml:space="preserve">Information required before the decision</w:t>
       </w:r>
     </w:p>
@@ -20583,11 +20991,17 @@
     </w:p>
     <w:p>
       <w:pPr>
+        <w:rPr>
+          <w:color w:val="A8470A"/>
+        </w:rPr>
         <w:pStyle w:val="Heading2"/>
         <w:keepNext/>
         <w:widowControl/>
       </w:pPr>
       <w:r>
+        <w:rPr>
+          <w:color w:val="A8470A"/>
+        </w:rPr>
         <w:t xml:space="preserve">6 Post transplant immunosuppression and graft monitoring</w:t>
       </w:r>
     </w:p>
@@ -20835,11 +21249,17 @@
     </w:p>
     <w:p>
       <w:pPr>
+        <w:rPr>
+          <w:color w:val="A8470A"/>
+        </w:rPr>
         <w:pStyle w:val="Heading2"/>
         <w:keepNext/>
         <w:widowControl/>
       </w:pPr>
       <w:r>
+        <w:rPr>
+          <w:color w:val="A8470A"/>
+        </w:rPr>
         <w:t xml:space="preserve">7 Post transplant oncologic surveillance</w:t>
       </w:r>
     </w:p>
@@ -20947,11 +21367,17 @@
     </w:p>
     <w:p>
       <w:pPr>
+        <w:rPr>
+          <w:color w:val="A8470A"/>
+        </w:rPr>
         <w:pStyle w:val="Heading2"/>
         <w:keepNext/>
         <w:widowControl/>
       </w:pPr>
       <w:r>
+        <w:rPr>
+          <w:color w:val="A8470A"/>
+        </w:rPr>
         <w:t xml:space="preserve">8 Management of recurrence</w:t>
       </w:r>
     </w:p>
@@ -21072,11 +21498,17 @@
     </w:p>
     <w:p>
       <w:pPr>
+        <w:rPr>
+          <w:color w:val="A8470A"/>
+        </w:rPr>
         <w:pStyle w:val="Heading2"/>
         <w:keepNext/>
         <w:widowControl/>
       </w:pPr>
       <w:r>
+        <w:rPr>
+          <w:color w:val="A8470A"/>
+        </w:rPr>
         <w:t xml:space="preserve">9 Data collection and safety oversight</w:t>
       </w:r>
     </w:p>
@@ -21147,12 +21579,18 @@
     </w:p>
     <w:p>
       <w:pPr>
+        <w:rPr>
+          <w:color w:val="A8470A"/>
+        </w:rPr>
         <w:pStyle w:val="Heading3"/>
         <w:keepNext/>
         <w:widowControl/>
       </w:pPr>
       <w:bookmarkStart w:id="7" w:name="ALLOC_B4"/>
       <w:r>
+        <w:rPr>
+          <w:color w:val="A8470A"/>
+        </w:rPr>
         <w:t xml:space="preserve">ALLOC-B4 — What data are required before expansion?</w:t>
       </w:r>
       <w:bookmarkEnd w:id="7"/>
@@ -21427,11 +21865,17 @@
     </w:p>
     <w:p>
       <w:pPr>
+        <w:rPr>
+          <w:color w:val="A8470A"/>
+        </w:rPr>
         <w:pStyle w:val="Heading3"/>
         <w:keepNext/>
         <w:widowControl/>
       </w:pPr>
       <w:r>
+        <w:rPr>
+          <w:color w:val="A8470A"/>
+        </w:rPr>
         <w:t xml:space="preserve">OPEN recommendation after the evidence review</w:t>
       </w:r>
     </w:p>
@@ -21833,11 +22277,17 @@
     </w:p>
     <w:p>
       <w:pPr>
+        <w:rPr>
+          <w:color w:val="A8470A"/>
+        </w:rPr>
         <w:pStyle w:val="Heading3"/>
         <w:keepNext/>
         <w:widowControl/>
       </w:pPr>
       <w:r>
+        <w:rPr>
+          <w:color w:val="A8470A"/>
+        </w:rPr>
         <w:t xml:space="preserve">Information required before the decision</w:t>
       </w:r>
     </w:p>
@@ -21925,33 +22375,51 @@
     </w:p>
     <w:p>
       <w:pPr>
+        <w:rPr>
+          <w:color w:val="A8470A"/>
+        </w:rPr>
         <w:pStyle w:val="Heading2"/>
         <w:keepNext/>
         <w:widowControl/>
       </w:pPr>
       <w:r>
+        <w:rPr>
+          <w:color w:val="A8470A"/>
+        </w:rPr>
         <w:t xml:space="preserve">10 Remaining decisions before expansion</w:t>
       </w:r>
     </w:p>
     <w:p>
       <w:pPr>
+        <w:rPr>
+          <w:color w:val="A8470A"/>
+        </w:rPr>
         <w:pStyle w:val="Heading3"/>
         <w:keepNext/>
         <w:widowControl/>
       </w:pPr>
       <w:bookmarkStart w:id="8" w:name="HCC_B4"/>
       <w:r>
+        <w:rPr>
+          <w:color w:val="A8470A"/>
+        </w:rPr>
         <w:t xml:space="preserve">HCC-B4 — Can a survival-benefit score influence organ priority?</w:t>
       </w:r>
       <w:bookmarkEnd w:id="8"/>
     </w:p>
     <w:p>
       <w:pPr>
+        <w:rPr>
+          <w:color w:val="A8470A"/>
+        </w:rPr>
         <w:pStyle w:val="Heading3"/>
         <w:keepNext/>
         <w:widowControl/>
       </w:pPr>
       <w:r>
+        <w:rPr>
+          <w:color w:val="A8470A"/>
+        </w:rPr>
         <w:t xml:space="preserve">Question and comparison</w:t>
       </w:r>
     </w:p>
@@ -21967,11 +22435,17 @@
     </w:p>
     <w:p>
       <w:pPr>
+        <w:rPr>
+          <w:color w:val="A8470A"/>
+        </w:rPr>
         <w:pStyle w:val="Heading3"/>
         <w:keepNext/>
         <w:widowControl/>
       </w:pPr>
       <w:r>
+        <w:rPr>
+          <w:color w:val="A8470A"/>
+        </w:rPr>
         <w:t xml:space="preserve">Evidence before choosing a rule</w:t>
       </w:r>
     </w:p>
@@ -23059,11 +23533,17 @@
     </w:tbl>
     <w:p>
       <w:pPr>
+        <w:rPr>
+          <w:color w:val="A8470A"/>
+        </w:rPr>
         <w:pStyle w:val="Heading3"/>
         <w:keepNext/>
         <w:widowControl/>
       </w:pPr>
       <w:r>
+        <w:rPr>
+          <w:color w:val="A8470A"/>
+        </w:rPr>
         <w:t xml:space="preserve">Synthesis and evidence that challenges the proposal</w:t>
       </w:r>
     </w:p>
@@ -23337,11 +23817,17 @@
     </w:p>
     <w:p>
       <w:pPr>
+        <w:rPr>
+          <w:color w:val="A8470A"/>
+        </w:rPr>
         <w:pStyle w:val="Heading3"/>
         <w:keepNext/>
         <w:widowControl/>
       </w:pPr>
       <w:r>
+        <w:rPr>
+          <w:color w:val="A8470A"/>
+        </w:rPr>
         <w:t xml:space="preserve">Where each proposed threshold comes from</w:t>
       </w:r>
     </w:p>
@@ -23361,11 +23847,17 @@
     </w:p>
     <w:p>
       <w:pPr>
+        <w:rPr>
+          <w:color w:val="A8470A"/>
+        </w:rPr>
         <w:pStyle w:val="Heading3"/>
         <w:keepNext/>
         <w:widowControl/>
       </w:pPr>
       <w:r>
+        <w:rPr>
+          <w:color w:val="A8470A"/>
+        </w:rPr>
         <w:t xml:space="preserve">Source wording — read in context</w:t>
       </w:r>
     </w:p>
@@ -23731,11 +24223,17 @@
     </w:p>
     <w:p>
       <w:pPr>
+        <w:rPr>
+          <w:color w:val="A8470A"/>
+        </w:rPr>
         <w:pStyle w:val="Heading3"/>
         <w:keepNext/>
         <w:widowControl/>
       </w:pPr>
       <w:r>
+        <w:rPr>
+          <w:color w:val="A8470A"/>
+        </w:rPr>
         <w:t xml:space="preserve">OPEN recommendation after the evidence review</w:t>
       </w:r>
     </w:p>
@@ -24054,11 +24552,17 @@
     </w:p>
     <w:p>
       <w:pPr>
+        <w:rPr>
+          <w:color w:val="A8470A"/>
+        </w:rPr>
         <w:pStyle w:val="Heading3"/>
         <w:keepNext/>
         <w:widowControl/>
       </w:pPr>
       <w:r>
+        <w:rPr>
+          <w:color w:val="A8470A"/>
+        </w:rPr>
         <w:t xml:space="preserve">Information required before the decision</w:t>
       </w:r>
     </w:p>
@@ -24187,12 +24691,18 @@
     </w:p>
     <w:p>
       <w:pPr>
+        <w:rPr>
+          <w:color w:val="A8470A"/>
+        </w:rPr>
         <w:pStyle w:val="Heading1"/>
         <w:keepNext/>
         <w:widowControl/>
         <w:keepLines/>
       </w:pPr>
       <w:r>
+        <w:rPr>
+          <w:color w:val="A8470A"/>
+        </w:rPr>
         <w:t xml:space="preserve">Revision note</w:t>
       </w:r>
     </w:p>
@@ -24308,11 +24818,17 @@
     </w:p>
     <w:p>
       <w:pPr>
+        <w:rPr>
+          <w:color w:val="A8470A"/>
+        </w:rPr>
         <w:pStyle w:val="Heading1"/>
         <w:widowControl/>
         <w:keepNext/>
       </w:pPr>
       <w:r>
+        <w:rPr>
+          <w:color w:val="A8470A"/>
+        </w:rPr>
         <w:t xml:space="preserve">References</w:t>
       </w:r>
     </w:p>
@@ -26352,11 +26868,17 @@
     </w:p>
     <w:p>
       <w:pPr>
+        <w:rPr>
+          <w:color w:val="A8470A"/>
+        </w:rPr>
         <w:pStyle w:val="Heading1"/>
         <w:widowControl/>
         <w:keepNext/>
       </w:pPr>
       <w:r>
+        <w:rPr>
+          <w:color w:val="A8470A"/>
+        </w:rPr>
         <w:t xml:space="preserve">V12 revision note</w:t>
       </w:r>
     </w:p>
@@ -27097,7 +27619,7 @@
         <w:bottom w:val="single" w:sz="24" w:space="0" w:color="E84C22" w:themeColor="accent1"/>
         <w:right w:val="single" w:sz="24" w:space="0" w:color="E84C22" w:themeColor="accent1"/>
       </w:pBdr>
-      <w:shd w:val="clear" w:color="auto" w:fill="E84C22" w:themeFill="accent1"/>
+      <w:shd w:val="clear" w:fill="FFFFFF"/>
       <w:spacing w:after="0"/>
       <w:outlineLvl w:val="0"/>
     </w:pPr>
@@ -27105,7 +27627,7 @@
       <w:b/>
       <w:bCs/>
       <w:caps/>
-      <w:color w:val="FFFFFF" w:themeColor="background1"/>
+      <w:color w:val="A8470A"/>
       <w:spacing w:val="15"/>
       <w:sz w:val="22"/>
       <w:szCs w:val="22"/>
@@ -27127,7 +27649,7 @@
         <w:bottom w:val="single" w:sz="24" w:space="0" w:color="FADAD2" w:themeColor="accent1" w:themeTint="33"/>
         <w:right w:val="single" w:sz="24" w:space="0" w:color="FADAD2" w:themeColor="accent1" w:themeTint="33"/>
       </w:pBdr>
-      <w:shd w:val="clear" w:color="auto" w:fill="FADAD2" w:themeFill="accent1" w:themeFillTint="33"/>
+      <w:shd w:val="clear" w:fill="FFFFFF"/>
       <w:spacing w:after="0"/>
       <w:outlineLvl w:val="1"/>
     </w:pPr>
@@ -27136,6 +27658,7 @@
       <w:spacing w:val="15"/>
       <w:sz w:val="22"/>
       <w:szCs w:val="22"/>
+      <w:color w:val="A8470A"/>
     </w:rPr>
   </w:style>
   <w:style w:type="paragraph" w:styleId="Heading3">
@@ -27157,7 +27680,7 @@
     </w:pPr>
     <w:rPr>
       <w:caps/>
-      <w:color w:val="77230C" w:themeColor="accent1" w:themeShade="7F"/>
+      <w:color w:val="A8470A"/>
       <w:spacing w:val="15"/>
       <w:sz w:val="22"/>
       <w:szCs w:val="22"/>
@@ -27183,7 +27706,7 @@
     </w:pPr>
     <w:rPr>
       <w:caps/>
-      <w:color w:val="B43412" w:themeColor="accent1" w:themeShade="BF"/>
+      <w:color w:val="A8470A"/>
       <w:spacing w:val="10"/>
       <w:sz w:val="22"/>
       <w:szCs w:val="22"/>
@@ -27208,7 +27731,7 @@
     </w:pPr>
     <w:rPr>
       <w:caps/>
-      <w:color w:val="B43412" w:themeColor="accent1" w:themeShade="BF"/>
+      <w:color w:val="A8470A"/>
       <w:spacing w:val="10"/>
       <w:sz w:val="22"/>
       <w:szCs w:val="22"/>
@@ -27233,7 +27756,7 @@
     </w:pPr>
     <w:rPr>
       <w:caps/>
-      <w:color w:val="B43412" w:themeColor="accent1" w:themeShade="BF"/>
+      <w:color w:val="A8470A"/>
       <w:spacing w:val="10"/>
       <w:sz w:val="22"/>
       <w:szCs w:val="22"/>
@@ -27255,7 +27778,7 @@
     </w:pPr>
     <w:rPr>
       <w:caps/>
-      <w:color w:val="B43412" w:themeColor="accent1" w:themeShade="BF"/>
+      <w:color w:val="A8470A"/>
       <w:spacing w:val="10"/>
       <w:sz w:val="22"/>
       <w:szCs w:val="22"/>
@@ -27280,6 +27803,7 @@
       <w:spacing w:val="10"/>
       <w:sz w:val="18"/>
       <w:szCs w:val="18"/>
+      <w:color w:val="A8470A"/>
     </w:rPr>
   </w:style>
   <w:style w:type="paragraph" w:styleId="Heading9">
@@ -27302,6 +27826,7 @@
       <w:spacing w:val="10"/>
       <w:sz w:val="18"/>
       <w:szCs w:val="18"/>
+      <w:color w:val="A8470A"/>
     </w:rPr>
   </w:style>
   <w:style w:type="character" w:default="1" w:styleId="DefaultParagraphFont">
@@ -27344,7 +27869,7 @@
     </w:pPr>
     <w:rPr>
       <w:caps/>
-      <w:color w:val="E84C22" w:themeColor="accent1"/>
+      <w:color w:val="A8470A"/>
       <w:spacing w:val="10"/>
       <w:kern w:val="28"/>
       <w:sz w:val="52"/>
@@ -27417,6 +27942,7 @@
     </w:rPr>
   </w:style>
   <w:style w:type="character" w:customStyle="1" w:styleId="Heading1Char">
+    <w:pPr/>
     <w:name w:val="Heading 1 Char"/>
     <w:basedOn w:val="DefaultParagraphFont"/>
     <w:link w:val="Heading1"/>
@@ -27426,12 +27952,13 @@
       <w:b/>
       <w:bCs/>
       <w:caps/>
-      <w:color w:val="FFFFFF" w:themeColor="background1"/>
+      <w:color w:val="A8470A"/>
       <w:spacing w:val="15"/>
       <w:shd w:val="clear" w:color="auto" w:fill="E84C22" w:themeFill="accent1"/>
     </w:rPr>
   </w:style>
   <w:style w:type="character" w:customStyle="1" w:styleId="Heading2Char">
+    <w:pPr/>
     <w:name w:val="Heading 2 Char"/>
     <w:basedOn w:val="DefaultParagraphFont"/>
     <w:link w:val="Heading2"/>
@@ -27441,9 +27968,11 @@
       <w:caps/>
       <w:spacing w:val="15"/>
       <w:shd w:val="clear" w:color="auto" w:fill="FADAD2" w:themeFill="accent1" w:themeFillTint="33"/>
+      <w:color w:val="A8470A"/>
     </w:rPr>
   </w:style>
   <w:style w:type="character" w:customStyle="1" w:styleId="Heading3Char">
+    <w:pPr/>
     <w:name w:val="Heading 3 Char"/>
     <w:basedOn w:val="DefaultParagraphFont"/>
     <w:link w:val="Heading3"/>
@@ -27451,11 +27980,12 @@
     <w:rsid w:val="008C56FB"/>
     <w:rPr>
       <w:caps/>
-      <w:color w:val="77230C" w:themeColor="accent1" w:themeShade="7F"/>
+      <w:color w:val="A8470A"/>
       <w:spacing w:val="15"/>
     </w:rPr>
   </w:style>
   <w:style w:type="character" w:customStyle="1" w:styleId="Heading4Char">
+    <w:pPr/>
     <w:name w:val="Heading 4 Char"/>
     <w:basedOn w:val="DefaultParagraphFont"/>
     <w:link w:val="Heading4"/>
@@ -27464,11 +27994,12 @@
     <w:rsid w:val="008C56FB"/>
     <w:rPr>
       <w:caps/>
-      <w:color w:val="B43412" w:themeColor="accent1" w:themeShade="BF"/>
+      <w:color w:val="A8470A"/>
       <w:spacing w:val="10"/>
     </w:rPr>
   </w:style>
   <w:style w:type="character" w:customStyle="1" w:styleId="Heading5Char">
+    <w:pPr/>
     <w:name w:val="Heading 5 Char"/>
     <w:basedOn w:val="DefaultParagraphFont"/>
     <w:link w:val="Heading5"/>
@@ -27477,11 +28008,12 @@
     <w:rsid w:val="008C56FB"/>
     <w:rPr>
       <w:caps/>
-      <w:color w:val="B43412" w:themeColor="accent1" w:themeShade="BF"/>
+      <w:color w:val="A8470A"/>
       <w:spacing w:val="10"/>
     </w:rPr>
   </w:style>
   <w:style w:type="character" w:customStyle="1" w:styleId="Heading6Char">
+    <w:pPr/>
     <w:name w:val="Heading 6 Char"/>
     <w:basedOn w:val="DefaultParagraphFont"/>
     <w:link w:val="Heading6"/>
@@ -27490,11 +28022,12 @@
     <w:rsid w:val="008C56FB"/>
     <w:rPr>
       <w:caps/>
-      <w:color w:val="B43412" w:themeColor="accent1" w:themeShade="BF"/>
+      <w:color w:val="A8470A"/>
       <w:spacing w:val="10"/>
     </w:rPr>
   </w:style>
   <w:style w:type="character" w:customStyle="1" w:styleId="Heading7Char">
+    <w:pPr/>
     <w:name w:val="Heading 7 Char"/>
     <w:basedOn w:val="DefaultParagraphFont"/>
     <w:link w:val="Heading7"/>
@@ -27503,11 +28036,12 @@
     <w:rsid w:val="008C56FB"/>
     <w:rPr>
       <w:caps/>
-      <w:color w:val="B43412" w:themeColor="accent1" w:themeShade="BF"/>
+      <w:color w:val="A8470A"/>
       <w:spacing w:val="10"/>
     </w:rPr>
   </w:style>
   <w:style w:type="character" w:customStyle="1" w:styleId="Heading8Char">
+    <w:pPr/>
     <w:name w:val="Heading 8 Char"/>
     <w:basedOn w:val="DefaultParagraphFont"/>
     <w:link w:val="Heading8"/>
@@ -27519,9 +28053,11 @@
       <w:spacing w:val="10"/>
       <w:sz w:val="18"/>
       <w:szCs w:val="18"/>
+      <w:color w:val="A8470A"/>
     </w:rPr>
   </w:style>
   <w:style w:type="character" w:customStyle="1" w:styleId="Heading9Char">
+    <w:pPr/>
     <w:name w:val="Heading 9 Char"/>
     <w:basedOn w:val="DefaultParagraphFont"/>
     <w:link w:val="Heading9"/>
@@ -27534,6 +28070,7 @@
       <w:spacing w:val="10"/>
       <w:sz w:val="18"/>
       <w:szCs w:val="18"/>
+      <w:color w:val="A8470A"/>
     </w:rPr>
   </w:style>
   <w:style w:type="paragraph" w:styleId="Caption">
@@ -27554,6 +28091,7 @@
     </w:rPr>
   </w:style>
   <w:style w:type="character" w:customStyle="1" w:styleId="TitleChar">
+    <w:pPr/>
     <w:name w:val="Title Char"/>
     <w:basedOn w:val="DefaultParagraphFont"/>
     <w:link w:val="Title"/>
@@ -27561,7 +28099,7 @@
     <w:rsid w:val="008C56FB"/>
     <w:rPr>
       <w:caps/>
-      <w:color w:val="E84C22" w:themeColor="accent1"/>
+      <w:color w:val="A8470A"/>
       <w:spacing w:val="10"/>
       <w:kern w:val="28"/>
       <w:sz w:val="52"/>
@@ -27581,13 +28119,14 @@
     </w:pPr>
     <w:rPr>
       <w:caps/>
-      <w:color w:val="595959" w:themeColor="text1" w:themeTint="A6"/>
+      <w:color w:val="A8470A"/>
       <w:spacing w:val="10"/>
       <w:sz w:val="24"/>
       <w:szCs w:val="24"/>
     </w:rPr>
   </w:style>
   <w:style w:type="character" w:customStyle="1" w:styleId="SubtitleChar">
+    <w:pPr/>
     <w:name w:val="Subtitle Char"/>
     <w:basedOn w:val="DefaultParagraphFont"/>
     <w:link w:val="Subtitle"/>
@@ -27595,7 +28134,7 @@
     <w:rsid w:val="008C56FB"/>
     <w:rPr>
       <w:caps/>
-      <w:color w:val="595959" w:themeColor="text1" w:themeTint="A6"/>
+      <w:color w:val="A8470A"/>
       <w:spacing w:val="10"/>
       <w:sz w:val="24"/>
       <w:szCs w:val="24"/>
@@ -27783,6 +28322,9 @@
     </w:pPr>
   </w:style>
   <w:style w:type="paragraph" w:styleId="Header">
+    <w:rPr>
+      <w:color w:val="A8470A"/>
+    </w:rPr>
     <w:name w:val="header"/>
     <w:basedOn w:val="Normal"/>
     <w:link w:val="HeaderChar"/>
@@ -27798,6 +28340,7 @@
     </w:pPr>
   </w:style>
   <w:style w:type="character" w:customStyle="1" w:styleId="HeaderChar">
+    <w:pPr/>
     <w:name w:val="Header Char"/>
     <w:basedOn w:val="DefaultParagraphFont"/>
     <w:link w:val="Header"/>
@@ -27806,6 +28349,7 @@
     <w:rPr>
       <w:sz w:val="20"/>
       <w:szCs w:val="20"/>
+      <w:color w:val="A8470A"/>
     </w:rPr>
   </w:style>
   <w:style w:type="paragraph" w:styleId="Footer">

</xml_diff>